<commit_message>
fix: add Factories Act / BMW Rules 2016 alongside CDC/NIOSH/OSHA (HRM9)
5.1 cited CDC/NIOSH generally and 5.3 cited OSHA Bloodborne Pathogens
guidance, with no Indian statutory reference. Added notes pointing to
the Factories Act 1948 (occupational health provisions) and the
Bio-Medical Waste Management Rules 2016 (sharps/infectious exposure)
as the binding Indian basis alongside this guidance.

Co-Authored-By: Claude Sonnet 5 <noreply@anthropic.com>
Claude-Session: https://claude.ai/code/session_01TPRLtLhmTCP5z94Q3FiE5v
</commit_message>
<xml_diff>
--- a/policies/build/chapters_v2/HRM/documents/HRM_Package_v2/HRM9/SOP_HRM9_staff_health_and_safety.docx
+++ b/policies/build/chapters_v2/HRM/documents/HRM_Package_v2/HRM9/SOP_HRM9_staff_health_and_safety.docx
@@ -321,34 +321,22 @@
     </w:p>
     <w:p>
       <w:r>
-        <w:t xml:space="preserve">HR In-Charge / Personnel Officer: </w:t>
-      </w:r>
-      <w:r>
-        <w:t>owns recruitment, training records, personal files and the day-to-day running of this policy, and keeps the required records current.</w:t>
+        <w:t xml:space="preserve">HR In-Charge / Personnel Officer: owns recruitment, training records, personal files and the day-to-day running of this policy, and keeps the required records current.</w:t>
       </w:r>
     </w:p>
     <w:p>
       <w:r>
-        <w:t xml:space="preserve">Medical Superintendent: </w:t>
-      </w:r>
-      <w:r>
-        <w:t>escalation point for any unresolved gap, and approves the workforce plan, contingency plan and credentialing/privileging decisions.</w:t>
+        <w:t xml:space="preserve">Medical Superintendent: escalation point for any unresolved gap, and approves the workforce plan, contingency plan and credentialing/privileging decisions.</w:t>
       </w:r>
     </w:p>
     <w:p>
       <w:r>
-        <w:t xml:space="preserve">Department Heads / Heads of Service: </w:t>
-      </w:r>
-      <w:r>
-        <w:t>identify their own department's staffing, training and credentialing needs, and support this policy's records at department level.</w:t>
+        <w:t xml:space="preserve">Department Heads / Heads of Service: identify their own department's staffing, training and credentialing needs, and support this policy's records at department level.</w:t>
       </w:r>
     </w:p>
     <w:p>
       <w:r>
-        <w:t xml:space="preserve">Quality Coordinator: </w:t>
-      </w:r>
-      <w:r>
-        <w:t>audits this policy periodically, checks records against the steps below, and flags gaps for corrective action.</w:t>
+        <w:t xml:space="preserve">Quality Coordinator: audits this policy periodically, checks records against the steps below, and flags gaps for corrective action.</w:t>
       </w:r>
     </w:p>
     <w:p>
@@ -452,6 +440,14 @@
           <w:t>Centers for Disease Control and Prevention, National Institute for Occupational Safety and Health (NIOSH).</w:t>
         </w:r>
       </w:hyperlink>
+    </w:p>
+    <w:p>
+      <w:pPr>
+        <w:pStyle w:val="ListParagraph"/>
+      </w:pPr>
+      <w:r>
+        <w:t>Note: CDC/NIOSH guidance is cited for technique only. The binding Indian statutory basis for occupational health and safety is the Factories Act, 1948 (occupational health provisions, applicable to hospitals as establishments), which applies alongside this guidance.</w:t>
+      </w:r>
     </w:p>
     <w:p>
       <w:pPr>
@@ -576,6 +572,14 @@
           <w:t>Occupational Safety and Health Administration. Bloodborne Pathogens — Evaluating and Controlling Exposure.</w:t>
         </w:r>
       </w:hyperlink>
+    </w:p>
+    <w:p>
+      <w:pPr>
+        <w:pStyle w:val="ListParagraph"/>
+      </w:pPr>
+      <w:r>
+        <w:t>Note: OSHA bloodborne-pathogens guidance is cited for exposure-control technique only. The Bio-Medical Waste Management Rules, 2016 is the applicable Indian regulatory reference for sharps and infectious-exposure handling, alongside this guidance.</w:t>
+      </w:r>
     </w:p>
     <w:p>
       <w:pPr>

</xml_diff>